<commit_message>
Update resume site and downloadable artifacts
</commit_message>
<xml_diff>
--- a/docs/output/Nick_Cinera_Resume.docx
+++ b/docs/output/Nick_Cinera_Resume.docx
@@ -31,7 +31,7 @@
           <w:color w:val="00587A"/>
           <w:sz w:val="19"/>
         </w:rPr>
-        <w:t>Trading Systems Engineer | High-Performance UI, Real-Time Data &amp; Distributed Systems</w:t>
+        <w:t>Trading Systems Engineer | Real-Time UI, Client/Server Architecture &amp; Workflow Platforms</w:t>
       </w:r>
     </w:p>
     <w:p>
@@ -63,7 +63,7 @@
           <w:color w:val="171D24"/>
           <w:sz w:val="17"/>
         </w:rPr>
-        <w:t>Software engineer at Goldman Sachs building latency-sensitive equity-derivatives and capital-markets platforms used by traders and deal teams. Owns React/TypeScript/AG Grid interfaces through Java/WebSocket services and production rollout, with deep experience in real-time state, large data grids, event-driven architecture, and controlled migration of desk-critical workflows.</w:t>
+        <w:t>Trading systems engineer with 3+ years at Goldman Sachs delivering desk-critical equity-derivatives and capital-markets platforms. Leads complex React/TypeScript/AG Grid delivery at the client/server boundary, integrating Java/WebSocket services, versioned real-time subscriptions, typed edit workflows, and controlled migrations. Proven ownership from requirements and architecture through testing, rollout, and production support.</w:t>
       </w:r>
     </w:p>
     <w:p>
@@ -123,7 +123,7 @@
           <w:color w:val="00587A"/>
           <w:sz w:val="16"/>
         </w:rPr>
-        <w:t xml:space="preserve">Real-Time &amp; Backend: </w:t>
+        <w:t xml:space="preserve">Systems &amp; Integration: </w:t>
       </w:r>
       <w:r>
         <w:rPr>
@@ -133,7 +133,7 @@
           <w:color w:val="171D24"/>
           <w:sz w:val="16"/>
         </w:rPr>
-        <w:t>Java, WebSocket, REST APIs, Node.js, Python, SQL, event-driven/distributed systems, normalized and denormalized projections</w:t>
+        <w:t>Java, WebSocket, REST APIs, Node.js, Python, SQL, RxJS, event-driven architecture, server-driven projections, versioned snapshot/delta subscriptions, typed contracts</w:t>
       </w:r>
     </w:p>
     <w:p>
@@ -159,7 +159,7 @@
           <w:color w:val="171D24"/>
           <w:sz w:val="16"/>
         </w:rPr>
-        <w:t>Equity derivatives RFQ/RFT (request-for-quote/request-for-trade) workflows, including RFS support, DCM new issuance, pricing grids, P&amp;L/fees, CI/CD, LaunchDarkly, canary rollouts, production hardening</w:t>
+        <w:t>Equity derivatives RFQ/RFT (request-for-quote/request-for-trade) workflows, including RFS support, DCM new issuance, pricing grids, workflow modeling, CI/CD, LaunchDarkly, canary rollouts, production hardening</w:t>
       </w:r>
     </w:p>
     <w:p>
@@ -175,7 +175,7 @@
           <w:color w:val="00587A"/>
           <w:sz w:val="16"/>
         </w:rPr>
-        <w:t xml:space="preserve">AI-Accelerated Engineering: </w:t>
+        <w:t xml:space="preserve">Technical Leadership: </w:t>
       </w:r>
       <w:r>
         <w:rPr>
@@ -185,7 +185,7 @@
           <w:color w:val="171D24"/>
           <w:sz w:val="16"/>
         </w:rPr>
-        <w:t>Agentic coding systems, repo-aware code generation, debugging and refactoring, test design, and review workflows grounded in builds, tests, and human validation</w:t>
+        <w:t>End-to-end feature ownership, cross-functional requirements, architecture migrations, testing and rollout strategy, production support, ICPC coaching, and AI-assisted engineering with human validation</w:t>
       </w:r>
     </w:p>
     <w:p>
@@ -318,7 +318,7 @@
           <w:color w:val="171D24"/>
           <w:sz w:val="18"/>
         </w:rPr>
-        <w:t>Own end-to-end delivery of a real-time, multi-leg pricing grid used by equity-derivatives traders to price and structure RFQ/RFT inquiries and trades, spanning the React/TypeScript/AG Grid UI, Java pricing and streaming tier, WebSocket protocol, and release configuration.</w:t>
+        <w:t>Own client and integration delivery for a real-time, multi-leg pricing grid used by equity-derivatives traders across RFQ/RFT/RFS workflows, spanning React/TypeScript, AG Grid, Redux/RxJS, typed Java/WebSocket contracts, release configuration, and production support.</w:t>
       </w:r>
     </w:p>
     <w:p>
@@ -334,7 +334,7 @@
           <w:color w:val="171D24"/>
           <w:sz w:val="18"/>
         </w:rPr>
-        <w:t>Led the incremental migration of a legacy client-heavy pricer to a server-authoritative, event-driven architecture; used a feature canary and parallel old/new-path validation to protect trader workflows while establishing parity and retiring legacy paths.</w:t>
+        <w:t>Led client-side adoption of a server-authoritative, event-driven table architecture alongside the legacy path, maintaining feature-canary controls and compatibility for incremental desk rollout without disrupting trader workflows.</w:t>
       </w:r>
     </w:p>
     <w:p>
@@ -350,7 +350,7 @@
           <w:color w:val="171D24"/>
           <w:sz w:val="18"/>
         </w:rPr>
-        <w:t>Designed a server-computed layout model that streams tabs, columns, nested per-leg grids, expansion state, styling, formatting, and cell-renderer metadata, keeping the browser focused on fast rendering and interaction rather than layout computation.</w:t>
+        <w:t>Built the config-driven rendering and editor layer for server-supplied tabs, tables, nested leg views, column schemas, and interaction metadata, keeping complex domain projection out of React components.</w:t>
       </w:r>
     </w:p>
     <w:p>
@@ -366,7 +366,7 @@
           <w:color w:val="171D24"/>
           <w:sz w:val="18"/>
         </w:rPr>
-        <w:t>Built normalized and denormalized projections from a shared domain model and diff-based WebSocket publishing, sending only changed structure and removing redundant per-event fields to reduce payload churn on a latency-sensitive path.</w:t>
+        <w:t>Implemented typed cell-edit workflows with select/dropdown behavior, no-op filtering, durable commands to the authoritative backend, and a separate autocomplete/reference-data query path.</w:t>
       </w:r>
     </w:p>
     <w:p>
@@ -382,7 +382,7 @@
           <w:color w:val="171D24"/>
           <w:sz w:val="18"/>
         </w:rPr>
-        <w:t>Delivered approximately 100 tracked work items across UI, Java services, and release configuration in 12 months, including 188 commits on the pricing-grid/data layer and 35 of 38 server-tier commits in the core pricing engine.</w:t>
+        <w:t>Integrated versioned snapshot/delta subscriptions and RxJS external-store row delivery into high-frequency AG Grid workflows, using equality guards and stale-state handling to preserve correctness and avoid unnecessary work.</w:t>
       </w:r>
     </w:p>
     <w:p>
@@ -398,7 +398,7 @@
           <w:color w:val="171D24"/>
           <w:sz w:val="18"/>
         </w:rPr>
-        <w:t>Use AI-assisted and agentic engineering workflows for repository-scale navigation, implementation planning, debugging, refactor decomposition, test design, and review, validating outputs against local builds, specifications, and production constraints.</w:t>
+        <w:t>Delivered approximately 100 tracked work items across client, configuration, testing, release, and production support in 12 months; partnered with backend and platform teams to validate parity and harden the new path.</w:t>
       </w:r>
     </w:p>
     <w:tbl>
@@ -529,7 +529,7 @@
           <w:color w:val="171D24"/>
           <w:sz w:val="18"/>
         </w:rPr>
-        <w:t>Built dense, keyboard-driven React/TypeScript and AG Grid workflows across Redux Toolkit/Module Federation and Redux/redux-observable (RxJS), integrating real-time updates and domain REST services.</w:t>
+        <w:t>Built dense, keyboard-driven React/TypeScript and AG Grid workflows across Redux Toolkit, Module Federation, and redux-observable/RxJS, integrating real-time updates, REST services, authorization, and complex financial rules.</w:t>
       </w:r>
     </w:p>
     <w:p>
@@ -545,7 +545,7 @@
           <w:color w:val="171D24"/>
           <w:sz w:val="18"/>
         </w:rPr>
-        <w:t>Operated an investor-analytics platform as a Module Federation host, loading remote applications through runtime-injected origins across development, QA, and production while keeping shared React/Redux dependencies singleton-safe.</w:t>
+        <w:t>Created reusable grid-preferences and export capabilities that preserved per-user layouts and kept CSV/Excel output aligned with on-screen order, visibility, widths, pinning, and precision.</w:t>
       </w:r>
     </w:p>
     <w:p>
@@ -561,7 +561,7 @@
           <w:color w:val="171D24"/>
           <w:sz w:val="18"/>
         </w:rPr>
-        <w:t>Created a reusable cross-tab grid-preferences and export framework that persisted each user's column order, visibility, widths, pinning, and reorder rules while keeping CSV/Excel output aligned with the on-screen layout.</w:t>
+        <w:t>Delivered P&amp;L/fee editing and investor-participation workflows end-to-end, including tab-and-enter navigation, dirty-state cues, multi-currency aggregation, API integration, authorization gating, and export parity.</w:t>
       </w:r>
     </w:p>
     <w:p>
@@ -577,23 +577,7 @@
           <w:color w:val="171D24"/>
           <w:sz w:val="18"/>
         </w:rPr>
-        <w:t>Delivered P&amp;L/fee editing and investor-participation workflows end-to-end, including tab-and-enter navigation, dirty-state cues, precision rules, multi-currency aggregation, API integration, authorization gating, and export parity.</w:t>
-      </w:r>
-    </w:p>
-    <w:p>
-      <w:pPr>
-        <w:pStyle w:val="ListBullet"/>
-        <w:spacing w:after="47"/>
-      </w:pPr>
-      <w:r>
-        <w:rPr>
-          <w:rFonts w:ascii="Aptos" w:hAnsi="Aptos"/>
-          <w:b w:val="0"/>
-          <w:i w:val="0"/>
-          <w:color w:val="171D24"/>
-          <w:sz w:val="18"/>
-        </w:rPr>
-        <w:t>Managed a versioned Funds Flow UI package integration through branch-conditional CI install rules, allowing integration testing against candidate upstream releases without destabilizing production release branches.</w:t>
+        <w:t>Operated a Module Federation host and versioned partner-package integrations across development, QA, and production, using branch-aware CI rules to test candidate releases without destabilizing production.</w:t>
       </w:r>
     </w:p>
     <w:p>
@@ -609,7 +593,7 @@
           <w:color w:val="171D24"/>
           <w:sz w:val="18"/>
         </w:rPr>
-        <w:t>Modernized both platforms through React 17-to-18 and AG Grid 23-to-30 migrations, node-sass removal, LaunchDarkly/UI toolkit/Node upgrades, Module Federation release configuration, and partner-package integration across managed CI/CD pipelines.</w:t>
+        <w:t>Led React 17-to-18 and AG Grid 23-to-30 migrations plus Node, styling, feature-flag, and shared-toolkit upgrades across managed CI/CD pipelines.</w:t>
       </w:r>
     </w:p>
     <w:tbl>

</xml_diff>